<commit_message>
v0.4.0: probado con lenguaje natural real; enrutado sin cruces y Word en orden del proceso
- Enrutador de líneas con pasillos, rodeos y penalización de tramos montados
- Etiquetas con posiciones alternativas sin pisar nodos, líneas ni etiquetas
- Word/Markdown: orden del proceso, compuertas legibles, plazos en palabras,
  roles con actividades, columna Sistemas, supuestos y puntos por validar,
  ficha con campos por completar, diagramas grandes en A3 con detalle
- preview -o .png integrado y AVISO diagrama
- SKILL: lenguaje coloquial, pedidos escuetos, uniones, bypass, plazos
- tests/: 5 casos reales + specs validadas en CI

Co-Authored-By: Claude Opus 5.5 <noreply@anthropic.com>
</commit_message>
<xml_diff>
--- a/docs/atencion-reclamos.docx
+++ b/docs/atencion-reclamos.docx
@@ -207,6 +207,68 @@
               <w:pStyle w:val="Celda"/>
             </w:pPr>
             <w:r>
+              <w:t xml:space="preserve">Revisado por</w:t>
+            </w:r>
+          </w:p>
+        </w:tc>
+        <w:tc>
+          <w:tcPr>
+            <w:tcW w:w="6803" w:type="dxa"/>
+          </w:tcPr>
+          <w:p>
+            <w:pPr>
+              <w:pStyle w:val="Celda"/>
+            </w:pPr>
+            <w:r>
+              <w:t xml:space="preserve">Por completar</w:t>
+            </w:r>
+          </w:p>
+        </w:tc>
+      </w:tr>
+      <w:tr>
+        <w:trPr>
+          <w:cantSplit/>
+        </w:trPr>
+        <w:tc>
+          <w:tcPr>
+            <w:tcW w:w="2834" w:type="dxa"/>
+          </w:tcPr>
+          <w:p>
+            <w:pPr>
+              <w:pStyle w:val="Celda"/>
+            </w:pPr>
+            <w:r>
+              <w:t xml:space="preserve">Aprobado por</w:t>
+            </w:r>
+          </w:p>
+        </w:tc>
+        <w:tc>
+          <w:tcPr>
+            <w:tcW w:w="6803" w:type="dxa"/>
+          </w:tcPr>
+          <w:p>
+            <w:pPr>
+              <w:pStyle w:val="Celda"/>
+            </w:pPr>
+            <w:r>
+              <w:t xml:space="preserve">Por completar</w:t>
+            </w:r>
+          </w:p>
+        </w:tc>
+      </w:tr>
+      <w:tr>
+        <w:trPr>
+          <w:cantSplit/>
+        </w:trPr>
+        <w:tc>
+          <w:tcPr>
+            <w:tcW w:w="2834" w:type="dxa"/>
+          </w:tcPr>
+          <w:p>
+            <w:pPr>
+              <w:pStyle w:val="Celda"/>
+            </w:pPr>
+            <w:r>
               <w:t xml:space="preserve">Fecha</w:t>
             </w:r>
           </w:p>
@@ -221,37 +283,6 @@
             </w:pPr>
             <w:r>
               <w:t xml:space="preserve">2026-10-26</w:t>
-            </w:r>
-          </w:p>
-        </w:tc>
-      </w:tr>
-      <w:tr>
-        <w:trPr>
-          <w:cantSplit/>
-        </w:trPr>
-        <w:tc>
-          <w:tcPr>
-            <w:tcW w:w="2834" w:type="dxa"/>
-          </w:tcPr>
-          <w:p>
-            <w:pPr>
-              <w:pStyle w:val="Celda"/>
-            </w:pPr>
-            <w:r>
-              <w:t xml:space="preserve">Generado con</w:t>
-            </w:r>
-          </w:p>
-        </w:tc>
-        <w:tc>
-          <w:tcPr>
-            <w:tcW w:w="6803" w:type="dxa"/>
-          </w:tcPr>
-          <w:p>
-            <w:pPr>
-              <w:pStyle w:val="Celda"/>
-            </w:pPr>
-            <w:r>
-              <w:t xml:space="preserve">bizagi-cli 0.3.0 (BPMN 2.0 para Bizagi Modeler)</w:t>
             </w:r>
           </w:p>
         </w:tc>
@@ -276,7 +307,7 @@
         <w:pStyle w:val="Heading1"/>
       </w:pPr>
       <w:r>
-        <w:t xml:space="preserve">2. Participantes y roles</w:t>
+        <w:t xml:space="preserve">2. Roles y responsabilidades</w:t>
       </w:r>
     </w:p>
     <w:tbl>
@@ -286,9 +317,9 @@
         <w:tblLayout w:type="fixed"/>
       </w:tblPr>
       <w:tblGrid>
-        <w:gridCol w:w="2224"/>
-        <w:gridCol w:w="3706"/>
-        <w:gridCol w:w="3706"/>
+        <w:gridCol w:w="2123"/>
+        <w:gridCol w:w="4573"/>
+        <w:gridCol w:w="2940"/>
       </w:tblGrid>
       <w:tr>
         <w:trPr>
@@ -297,7 +328,7 @@
         </w:trPr>
         <w:tc>
           <w:tcPr>
-            <w:tcW w:w="2224" w:type="dxa"/>
+            <w:tcW w:w="2123" w:type="dxa"/>
             <w:shd w:val="clear" w:color="auto" w:fill="E8601C"/>
           </w:tcPr>
           <w:p>
@@ -309,13 +340,13 @@
                 <w:b/>
                 <w:color w:val="FFFFFF"/>
               </w:rPr>
-              <w:t xml:space="preserve">Participante</w:t>
-            </w:r>
-          </w:p>
-        </w:tc>
-        <w:tc>
-          <w:tcPr>
-            <w:tcW w:w="3706" w:type="dxa"/>
+              <w:t xml:space="preserve">Rol</w:t>
+            </w:r>
+          </w:p>
+        </w:tc>
+        <w:tc>
+          <w:tcPr>
+            <w:tcW w:w="4573" w:type="dxa"/>
             <w:shd w:val="clear" w:color="auto" w:fill="E8601C"/>
           </w:tcPr>
           <w:p>
@@ -327,13 +358,13 @@
                 <w:b/>
                 <w:color w:val="FFFFFF"/>
               </w:rPr>
-              <w:t xml:space="preserve">Roles (carriles)</w:t>
-            </w:r>
-          </w:p>
-        </w:tc>
-        <w:tc>
-          <w:tcPr>
-            <w:tcW w:w="3706" w:type="dxa"/>
+              <w:t xml:space="preserve">Actividades a cargo</w:t>
+            </w:r>
+          </w:p>
+        </w:tc>
+        <w:tc>
+          <w:tcPr>
+            <w:tcW w:w="2940" w:type="dxa"/>
             <w:shd w:val="clear" w:color="auto" w:fill="E8601C"/>
           </w:tcPr>
           <w:p>
@@ -356,51 +387,139 @@
         </w:trPr>
         <w:tc>
           <w:tcPr>
-            <w:tcW w:w="2224" w:type="dxa"/>
-          </w:tcPr>
-          <w:p>
-            <w:pPr>
-              <w:pStyle w:val="Celda"/>
-            </w:pPr>
-            <w:r>
-              <w:t xml:space="preserve">Entidad</w:t>
-            </w:r>
-          </w:p>
-        </w:tc>
-        <w:tc>
-          <w:tcPr>
-            <w:tcW w:w="3706" w:type="dxa"/>
-          </w:tcPr>
-          <w:p>
-            <w:pPr>
-              <w:pStyle w:val="Celda"/>
-            </w:pPr>
-            <w:r>
-              <w:t xml:space="preserve">Mesa de partes, Área responsable, Jefatura</w:t>
-            </w:r>
-          </w:p>
-        </w:tc>
-        <w:tc>
-          <w:tcPr>
-            <w:tcW w:w="3706" w:type="dxa"/>
-          </w:tcPr>
-          <w:p>
-            <w:pPr>
-              <w:pStyle w:val="Celda"/>
-            </w:pPr>
-            <w:r>
-              <w:t xml:space="preserve">—</w:t>
-            </w:r>
-          </w:p>
-        </w:tc>
-      </w:tr>
-      <w:tr>
-        <w:trPr>
-          <w:cantSplit/>
-        </w:trPr>
-        <w:tc>
-          <w:tcPr>
-            <w:tcW w:w="2224" w:type="dxa"/>
+            <w:tcW w:w="2123" w:type="dxa"/>
+          </w:tcPr>
+          <w:p>
+            <w:pPr>
+              <w:pStyle w:val="Celda"/>
+            </w:pPr>
+            <w:r>
+              <w:t xml:space="preserve">Mesa de partes</w:t>
+            </w:r>
+          </w:p>
+        </w:tc>
+        <w:tc>
+          <w:tcPr>
+            <w:tcW w:w="4573" w:type="dxa"/>
+          </w:tcPr>
+          <w:p>
+            <w:pPr>
+              <w:pStyle w:val="Celda"/>
+            </w:pPr>
+            <w:r>
+              <w:t xml:space="preserve">Registrar reclamo; Clasificar reclamo; Notificar improcedencia; Notificar respuesta; Notificar en físico</w:t>
+            </w:r>
+          </w:p>
+        </w:tc>
+        <w:tc>
+          <w:tcPr>
+            <w:tcW w:w="2940" w:type="dxa"/>
+          </w:tcPr>
+          <w:p>
+            <w:pPr>
+              <w:pStyle w:val="Celda"/>
+            </w:pPr>
+            <w:r>
+              <w:t xml:space="preserve">—</w:t>
+            </w:r>
+          </w:p>
+        </w:tc>
+      </w:tr>
+      <w:tr>
+        <w:trPr>
+          <w:cantSplit/>
+        </w:trPr>
+        <w:tc>
+          <w:tcPr>
+            <w:tcW w:w="2123" w:type="dxa"/>
+          </w:tcPr>
+          <w:p>
+            <w:pPr>
+              <w:pStyle w:val="Celda"/>
+            </w:pPr>
+            <w:r>
+              <w:t xml:space="preserve">Área responsable</w:t>
+            </w:r>
+          </w:p>
+        </w:tc>
+        <w:tc>
+          <w:tcPr>
+            <w:tcW w:w="4573" w:type="dxa"/>
+          </w:tcPr>
+          <w:p>
+            <w:pPr>
+              <w:pStyle w:val="Celda"/>
+            </w:pPr>
+            <w:r>
+              <w:t xml:space="preserve">Evaluar reclamo; Redactar respuesta</w:t>
+            </w:r>
+          </w:p>
+        </w:tc>
+        <w:tc>
+          <w:tcPr>
+            <w:tcW w:w="2940" w:type="dxa"/>
+          </w:tcPr>
+          <w:p>
+            <w:pPr>
+              <w:pStyle w:val="Celda"/>
+            </w:pPr>
+            <w:r>
+              <w:t xml:space="preserve">—</w:t>
+            </w:r>
+          </w:p>
+        </w:tc>
+      </w:tr>
+      <w:tr>
+        <w:trPr>
+          <w:cantSplit/>
+        </w:trPr>
+        <w:tc>
+          <w:tcPr>
+            <w:tcW w:w="2123" w:type="dxa"/>
+          </w:tcPr>
+          <w:p>
+            <w:pPr>
+              <w:pStyle w:val="Celda"/>
+            </w:pPr>
+            <w:r>
+              <w:t xml:space="preserve">Jefatura</w:t>
+            </w:r>
+          </w:p>
+        </w:tc>
+        <w:tc>
+          <w:tcPr>
+            <w:tcW w:w="4573" w:type="dxa"/>
+          </w:tcPr>
+          <w:p>
+            <w:pPr>
+              <w:pStyle w:val="Celda"/>
+            </w:pPr>
+            <w:r>
+              <w:t xml:space="preserve">Alertar a jefatura; Resolver por jefatura</w:t>
+            </w:r>
+          </w:p>
+        </w:tc>
+        <w:tc>
+          <w:tcPr>
+            <w:tcW w:w="2940" w:type="dxa"/>
+          </w:tcPr>
+          <w:p>
+            <w:pPr>
+              <w:pStyle w:val="Celda"/>
+            </w:pPr>
+            <w:r>
+              <w:t xml:space="preserve">—</w:t>
+            </w:r>
+          </w:p>
+        </w:tc>
+      </w:tr>
+      <w:tr>
+        <w:trPr>
+          <w:cantSplit/>
+        </w:trPr>
+        <w:tc>
+          <w:tcPr>
+            <w:tcW w:w="2123" w:type="dxa"/>
           </w:tcPr>
           <w:p>
             <w:pPr>
@@ -413,7 +532,7 @@
         </w:tc>
         <w:tc>
           <w:tcPr>
-            <w:tcW w:w="3706" w:type="dxa"/>
+            <w:tcW w:w="4573" w:type="dxa"/>
           </w:tcPr>
           <w:p>
             <w:pPr>
@@ -426,7 +545,7 @@
         </w:tc>
         <w:tc>
           <w:tcPr>
-            <w:tcW w:w="3706" w:type="dxa"/>
+            <w:tcW w:w="2940" w:type="dxa"/>
           </w:tcPr>
           <w:p>
             <w:pPr>
@@ -465,7 +584,7 @@
         <w:drawing>
           <wp:inline distT="0" distB="0" distL="0" distR="0">
             <wp:extent cx="8890626" cy="5231130"/>
-            <wp:docPr id="1" name="Diagrama del proceso" descr="Diagrama BPMN del proceso Atención de reclamos"/>
+            <wp:docPr id="1" name="Diagrama 1" descr="Diagrama BPMN del proceso Atención de reclamos"/>
             <wp:cNvGraphicFramePr>
               <a:graphicFrameLocks noChangeAspect="1"/>
             </wp:cNvGraphicFramePr>
@@ -473,14 +592,14 @@
               <a:graphicData uri="http://schemas.openxmlformats.org/drawingml/2006/picture">
                 <pic:pic>
                   <pic:nvPicPr>
-                    <pic:cNvPr id="1" name="diagrama.png"/>
+                    <pic:cNvPr id="1" name="diagrama1.png"/>
                     <pic:cNvPicPr/>
                   </pic:nvPicPr>
                   <pic:blipFill>
-                    <a:blip r:embed="rIdPng">
+                    <a:blip r:embed="rIdPng1">
                       <a:extLst>
                         <a:ext uri="{96DAC541-7B7A-43D3-8B79-37D633B846F1}">
-                          <asvg:svgBlip xmlns:asvg="http://schemas.microsoft.com/office/drawing/2016/SVG/main" r:embed="rIdSvg"/>
+                          <asvg:svgBlip xmlns:asvg="http://schemas.microsoft.com/office/drawing/2016/SVG/main" r:embed="rIdSvg1"/>
                         </a:ext>
                       </a:extLst>
                     </a:blip>
@@ -509,8 +628,17 @@
         <w:pStyle w:val="Caption"/>
       </w:pPr>
       <w:r>
-        <w:t xml:space="preserve">Figura 1. Atención de reclamos (BPMN 2.0). El archivo .bpmn se importa en Bizagi Modeler desde Exportar/Importar → Importar → BPMN.</w:t>
-      </w:r>
+        <w:t xml:space="preserve">Figura 1. Atención de reclamos. El archivo .bpmn se importa en Bizagi Modeler desde Exportar/Importar → Importar → BPMN.</w:t>
+      </w:r>
+    </w:p>
+    <w:p>
+      <w:pPr>
+        <w:sectPr>
+          <w:footerReference w:type="default" r:id="rIdFooter"/>
+          <w:pgSz w:w="16838" w:h="11906" w:orient="landscape"/>
+          <w:pgMar w:top="1134" w:right="1134" w:bottom="1134" w:left="1134" w:header="567" w:footer="567" w:gutter="0"/>
+        </w:sectPr>
+      </w:pPr>
     </w:p>
     <w:p>
       <w:pPr>
@@ -523,17 +651,18 @@
     <w:tbl>
       <w:tblPr>
         <w:tblStyle w:val="Tabla"/>
-        <w:tblW w:w="14570" w:type="dxa"/>
+        <w:tblW w:w="14565" w:type="dxa"/>
         <w:tblLayout w:type="fixed"/>
       </w:tblPr>
       <w:tblGrid>
-        <w:gridCol w:w="558"/>
-        <w:gridCol w:w="2480"/>
-        <w:gridCol w:w="1612"/>
-        <w:gridCol w:w="1736"/>
-        <w:gridCol w:w="1860"/>
-        <w:gridCol w:w="1860"/>
-        <w:gridCol w:w="4464"/>
+        <w:gridCol w:w="539"/>
+        <w:gridCol w:w="2278"/>
+        <w:gridCol w:w="1439"/>
+        <w:gridCol w:w="1558"/>
+        <w:gridCol w:w="1678"/>
+        <w:gridCol w:w="1678"/>
+        <w:gridCol w:w="1558"/>
+        <w:gridCol w:w="3837"/>
       </w:tblGrid>
       <w:tr>
         <w:trPr>
@@ -542,7 +671,7 @@
         </w:trPr>
         <w:tc>
           <w:tcPr>
-            <w:tcW w:w="558" w:type="dxa"/>
+            <w:tcW w:w="539" w:type="dxa"/>
             <w:shd w:val="clear" w:color="auto" w:fill="E8601C"/>
           </w:tcPr>
           <w:p>
@@ -560,7 +689,7 @@
         </w:tc>
         <w:tc>
           <w:tcPr>
-            <w:tcW w:w="2480" w:type="dxa"/>
+            <w:tcW w:w="2278" w:type="dxa"/>
             <w:shd w:val="clear" w:color="auto" w:fill="E8601C"/>
           </w:tcPr>
           <w:p>
@@ -578,7 +707,7 @@
         </w:tc>
         <w:tc>
           <w:tcPr>
-            <w:tcW w:w="1612" w:type="dxa"/>
+            <w:tcW w:w="1439" w:type="dxa"/>
             <w:shd w:val="clear" w:color="auto" w:fill="E8601C"/>
           </w:tcPr>
           <w:p>
@@ -596,7 +725,7 @@
         </w:tc>
         <w:tc>
           <w:tcPr>
-            <w:tcW w:w="1736" w:type="dxa"/>
+            <w:tcW w:w="1558" w:type="dxa"/>
             <w:shd w:val="clear" w:color="auto" w:fill="E8601C"/>
           </w:tcPr>
           <w:p>
@@ -614,7 +743,7 @@
         </w:tc>
         <w:tc>
           <w:tcPr>
-            <w:tcW w:w="1860" w:type="dxa"/>
+            <w:tcW w:w="1678" w:type="dxa"/>
             <w:shd w:val="clear" w:color="auto" w:fill="E8601C"/>
           </w:tcPr>
           <w:p>
@@ -632,7 +761,7 @@
         </w:tc>
         <w:tc>
           <w:tcPr>
-            <w:tcW w:w="1860" w:type="dxa"/>
+            <w:tcW w:w="1678" w:type="dxa"/>
             <w:shd w:val="clear" w:color="auto" w:fill="E8601C"/>
           </w:tcPr>
           <w:p>
@@ -650,7 +779,25 @@
         </w:tc>
         <w:tc>
           <w:tcPr>
-            <w:tcW w:w="4464" w:type="dxa"/>
+            <w:tcW w:w="1558" w:type="dxa"/>
+            <w:shd w:val="clear" w:color="auto" w:fill="E8601C"/>
+          </w:tcPr>
+          <w:p>
+            <w:pPr>
+              <w:pStyle w:val="Celda"/>
+            </w:pPr>
+            <w:r>
+              <w:rPr>
+                <w:b/>
+                <w:color w:val="FFFFFF"/>
+              </w:rPr>
+              <w:t xml:space="preserve">Sistemas</w:t>
+            </w:r>
+          </w:p>
+        </w:tc>
+        <w:tc>
+          <w:tcPr>
+            <w:tcW w:w="3837" w:type="dxa"/>
             <w:shd w:val="clear" w:color="auto" w:fill="E8601C"/>
           </w:tcPr>
           <w:p>
@@ -673,7 +820,7 @@
         </w:trPr>
         <w:tc>
           <w:tcPr>
-            <w:tcW w:w="558" w:type="dxa"/>
+            <w:tcW w:w="539" w:type="dxa"/>
           </w:tcPr>
           <w:p>
             <w:pPr>
@@ -686,7 +833,7 @@
         </w:tc>
         <w:tc>
           <w:tcPr>
-            <w:tcW w:w="2480" w:type="dxa"/>
+            <w:tcW w:w="2278" w:type="dxa"/>
           </w:tcPr>
           <w:p>
             <w:pPr>
@@ -699,7 +846,7 @@
         </w:tc>
         <w:tc>
           <w:tcPr>
-            <w:tcW w:w="1612" w:type="dxa"/>
+            <w:tcW w:w="1439" w:type="dxa"/>
           </w:tcPr>
           <w:p>
             <w:pPr>
@@ -712,7 +859,7 @@
         </w:tc>
         <w:tc>
           <w:tcPr>
-            <w:tcW w:w="1736" w:type="dxa"/>
+            <w:tcW w:w="1558" w:type="dxa"/>
           </w:tcPr>
           <w:p>
             <w:pPr>
@@ -725,7 +872,7 @@
         </w:tc>
         <w:tc>
           <w:tcPr>
-            <w:tcW w:w="1860" w:type="dxa"/>
+            <w:tcW w:w="1678" w:type="dxa"/>
           </w:tcPr>
           <w:p>
             <w:pPr>
@@ -738,7 +885,20 @@
         </w:tc>
         <w:tc>
           <w:tcPr>
-            <w:tcW w:w="1860" w:type="dxa"/>
+            <w:tcW w:w="1678" w:type="dxa"/>
+          </w:tcPr>
+          <w:p>
+            <w:pPr>
+              <w:pStyle w:val="Celda"/>
+            </w:pPr>
+            <w:r>
+              <w:t xml:space="preserve">—</w:t>
+            </w:r>
+          </w:p>
+        </w:tc>
+        <w:tc>
+          <w:tcPr>
+            <w:tcW w:w="1558" w:type="dxa"/>
           </w:tcPr>
           <w:p>
             <w:pPr>
@@ -751,7 +911,7 @@
         </w:tc>
         <w:tc>
           <w:tcPr>
-            <w:tcW w:w="4464" w:type="dxa"/>
+            <w:tcW w:w="3837" w:type="dxa"/>
           </w:tcPr>
           <w:p>
             <w:pPr>
@@ -769,7 +929,7 @@
         </w:trPr>
         <w:tc>
           <w:tcPr>
-            <w:tcW w:w="558" w:type="dxa"/>
+            <w:tcW w:w="539" w:type="dxa"/>
           </w:tcPr>
           <w:p>
             <w:pPr>
@@ -782,7 +942,7 @@
         </w:tc>
         <w:tc>
           <w:tcPr>
-            <w:tcW w:w="2480" w:type="dxa"/>
+            <w:tcW w:w="2278" w:type="dxa"/>
           </w:tcPr>
           <w:p>
             <w:pPr>
@@ -795,7 +955,7 @@
         </w:tc>
         <w:tc>
           <w:tcPr>
-            <w:tcW w:w="1612" w:type="dxa"/>
+            <w:tcW w:w="1439" w:type="dxa"/>
           </w:tcPr>
           <w:p>
             <w:pPr>
@@ -808,7 +968,7 @@
         </w:tc>
         <w:tc>
           <w:tcPr>
-            <w:tcW w:w="1736" w:type="dxa"/>
+            <w:tcW w:w="1558" w:type="dxa"/>
           </w:tcPr>
           <w:p>
             <w:pPr>
@@ -821,51 +981,64 @@
         </w:tc>
         <w:tc>
           <w:tcPr>
-            <w:tcW w:w="1860" w:type="dxa"/>
-          </w:tcPr>
-          <w:p>
-            <w:pPr>
-              <w:pStyle w:val="Celda"/>
-            </w:pPr>
-            <w:r>
-              <w:t xml:space="preserve">—</w:t>
-            </w:r>
-          </w:p>
-        </w:tc>
-        <w:tc>
-          <w:tcPr>
-            <w:tcW w:w="1860" w:type="dxa"/>
-          </w:tcPr>
-          <w:p>
-            <w:pPr>
-              <w:pStyle w:val="Celda"/>
-            </w:pPr>
-            <w:r>
-              <w:t xml:space="preserve">—</w:t>
-            </w:r>
-          </w:p>
-        </w:tc>
-        <w:tc>
-          <w:tcPr>
-            <w:tcW w:w="4464" w:type="dxa"/>
-          </w:tcPr>
-          <w:p>
-            <w:pPr>
-              <w:pStyle w:val="Celda"/>
-            </w:pPr>
-            <w:r>
-              <w:t xml:space="preserve">—</w:t>
-            </w:r>
-          </w:p>
-        </w:tc>
-      </w:tr>
-      <w:tr>
-        <w:trPr>
-          <w:cantSplit/>
-        </w:trPr>
-        <w:tc>
-          <w:tcPr>
-            <w:tcW w:w="558" w:type="dxa"/>
+            <w:tcW w:w="1678" w:type="dxa"/>
+          </w:tcPr>
+          <w:p>
+            <w:pPr>
+              <w:pStyle w:val="Celda"/>
+            </w:pPr>
+            <w:r>
+              <w:t xml:space="preserve">—</w:t>
+            </w:r>
+          </w:p>
+        </w:tc>
+        <w:tc>
+          <w:tcPr>
+            <w:tcW w:w="1678" w:type="dxa"/>
+          </w:tcPr>
+          <w:p>
+            <w:pPr>
+              <w:pStyle w:val="Celda"/>
+            </w:pPr>
+            <w:r>
+              <w:t xml:space="preserve">—</w:t>
+            </w:r>
+          </w:p>
+        </w:tc>
+        <w:tc>
+          <w:tcPr>
+            <w:tcW w:w="1558" w:type="dxa"/>
+          </w:tcPr>
+          <w:p>
+            <w:pPr>
+              <w:pStyle w:val="Celda"/>
+            </w:pPr>
+            <w:r>
+              <w:t xml:space="preserve">—</w:t>
+            </w:r>
+          </w:p>
+        </w:tc>
+        <w:tc>
+          <w:tcPr>
+            <w:tcW w:w="3837" w:type="dxa"/>
+          </w:tcPr>
+          <w:p>
+            <w:pPr>
+              <w:pStyle w:val="Celda"/>
+            </w:pPr>
+            <w:r>
+              <w:t xml:space="preserve">—</w:t>
+            </w:r>
+          </w:p>
+        </w:tc>
+      </w:tr>
+      <w:tr>
+        <w:trPr>
+          <w:cantSplit/>
+        </w:trPr>
+        <w:tc>
+          <w:tcPr>
+            <w:tcW w:w="539" w:type="dxa"/>
           </w:tcPr>
           <w:p>
             <w:pPr>
@@ -878,7 +1051,7 @@
         </w:tc>
         <w:tc>
           <w:tcPr>
-            <w:tcW w:w="2480" w:type="dxa"/>
+            <w:tcW w:w="2278" w:type="dxa"/>
           </w:tcPr>
           <w:p>
             <w:pPr>
@@ -891,7 +1064,7 @@
         </w:tc>
         <w:tc>
           <w:tcPr>
-            <w:tcW w:w="1612" w:type="dxa"/>
+            <w:tcW w:w="1439" w:type="dxa"/>
           </w:tcPr>
           <w:p>
             <w:pPr>
@@ -904,7 +1077,7 @@
         </w:tc>
         <w:tc>
           <w:tcPr>
-            <w:tcW w:w="1736" w:type="dxa"/>
+            <w:tcW w:w="1558" w:type="dxa"/>
           </w:tcPr>
           <w:p>
             <w:pPr>
@@ -917,51 +1090,64 @@
         </w:tc>
         <w:tc>
           <w:tcPr>
-            <w:tcW w:w="1860" w:type="dxa"/>
-          </w:tcPr>
-          <w:p>
-            <w:pPr>
-              <w:pStyle w:val="Celda"/>
-            </w:pPr>
-            <w:r>
-              <w:t xml:space="preserve">—</w:t>
-            </w:r>
-          </w:p>
-        </w:tc>
-        <w:tc>
-          <w:tcPr>
-            <w:tcW w:w="1860" w:type="dxa"/>
-          </w:tcPr>
-          <w:p>
-            <w:pPr>
-              <w:pStyle w:val="Celda"/>
-            </w:pPr>
-            <w:r>
-              <w:t xml:space="preserve">—</w:t>
-            </w:r>
-          </w:p>
-        </w:tc>
-        <w:tc>
-          <w:tcPr>
-            <w:tcW w:w="4464" w:type="dxa"/>
-          </w:tcPr>
-          <w:p>
-            <w:pPr>
-              <w:pStyle w:val="Celda"/>
-            </w:pPr>
-            <w:r>
-              <w:t xml:space="preserve">—</w:t>
-            </w:r>
-          </w:p>
-        </w:tc>
-      </w:tr>
-      <w:tr>
-        <w:trPr>
-          <w:cantSplit/>
-        </w:trPr>
-        <w:tc>
-          <w:tcPr>
-            <w:tcW w:w="558" w:type="dxa"/>
+            <w:tcW w:w="1678" w:type="dxa"/>
+          </w:tcPr>
+          <w:p>
+            <w:pPr>
+              <w:pStyle w:val="Celda"/>
+            </w:pPr>
+            <w:r>
+              <w:t xml:space="preserve">—</w:t>
+            </w:r>
+          </w:p>
+        </w:tc>
+        <w:tc>
+          <w:tcPr>
+            <w:tcW w:w="1678" w:type="dxa"/>
+          </w:tcPr>
+          <w:p>
+            <w:pPr>
+              <w:pStyle w:val="Celda"/>
+            </w:pPr>
+            <w:r>
+              <w:t xml:space="preserve">—</w:t>
+            </w:r>
+          </w:p>
+        </w:tc>
+        <w:tc>
+          <w:tcPr>
+            <w:tcW w:w="1558" w:type="dxa"/>
+          </w:tcPr>
+          <w:p>
+            <w:pPr>
+              <w:pStyle w:val="Celda"/>
+            </w:pPr>
+            <w:r>
+              <w:t xml:space="preserve">—</w:t>
+            </w:r>
+          </w:p>
+        </w:tc>
+        <w:tc>
+          <w:tcPr>
+            <w:tcW w:w="3837" w:type="dxa"/>
+          </w:tcPr>
+          <w:p>
+            <w:pPr>
+              <w:pStyle w:val="Celda"/>
+            </w:pPr>
+            <w:r>
+              <w:t xml:space="preserve">—</w:t>
+            </w:r>
+          </w:p>
+        </w:tc>
+      </w:tr>
+      <w:tr>
+        <w:trPr>
+          <w:cantSplit/>
+        </w:trPr>
+        <w:tc>
+          <w:tcPr>
+            <w:tcW w:w="539" w:type="dxa"/>
           </w:tcPr>
           <w:p>
             <w:pPr>
@@ -974,7 +1160,7 @@
         </w:tc>
         <w:tc>
           <w:tcPr>
-            <w:tcW w:w="2480" w:type="dxa"/>
+            <w:tcW w:w="2278" w:type="dxa"/>
           </w:tcPr>
           <w:p>
             <w:pPr>
@@ -987,7 +1173,7 @@
         </w:tc>
         <w:tc>
           <w:tcPr>
-            <w:tcW w:w="1612" w:type="dxa"/>
+            <w:tcW w:w="1439" w:type="dxa"/>
           </w:tcPr>
           <w:p>
             <w:pPr>
@@ -1000,7 +1186,7 @@
         </w:tc>
         <w:tc>
           <w:tcPr>
-            <w:tcW w:w="1736" w:type="dxa"/>
+            <w:tcW w:w="1558" w:type="dxa"/>
           </w:tcPr>
           <w:p>
             <w:pPr>
@@ -1013,51 +1199,64 @@
         </w:tc>
         <w:tc>
           <w:tcPr>
-            <w:tcW w:w="1860" w:type="dxa"/>
-          </w:tcPr>
-          <w:p>
-            <w:pPr>
-              <w:pStyle w:val="Celda"/>
-            </w:pPr>
-            <w:r>
-              <w:t xml:space="preserve">—</w:t>
-            </w:r>
-          </w:p>
-        </w:tc>
-        <w:tc>
-          <w:tcPr>
-            <w:tcW w:w="1860" w:type="dxa"/>
-          </w:tcPr>
-          <w:p>
-            <w:pPr>
-              <w:pStyle w:val="Celda"/>
-            </w:pPr>
-            <w:r>
-              <w:t xml:space="preserve">—</w:t>
-            </w:r>
-          </w:p>
-        </w:tc>
-        <w:tc>
-          <w:tcPr>
-            <w:tcW w:w="4464" w:type="dxa"/>
-          </w:tcPr>
-          <w:p>
-            <w:pPr>
-              <w:pStyle w:val="Celda"/>
-            </w:pPr>
-            <w:r>
-              <w:t xml:space="preserve">Plazo legal: 30 días hábiles</w:t>
-            </w:r>
-          </w:p>
-        </w:tc>
-      </w:tr>
-      <w:tr>
-        <w:trPr>
-          <w:cantSplit/>
-        </w:trPr>
-        <w:tc>
-          <w:tcPr>
-            <w:tcW w:w="558" w:type="dxa"/>
+            <w:tcW w:w="1678" w:type="dxa"/>
+          </w:tcPr>
+          <w:p>
+            <w:pPr>
+              <w:pStyle w:val="Celda"/>
+            </w:pPr>
+            <w:r>
+              <w:t xml:space="preserve">—</w:t>
+            </w:r>
+          </w:p>
+        </w:tc>
+        <w:tc>
+          <w:tcPr>
+            <w:tcW w:w="1678" w:type="dxa"/>
+          </w:tcPr>
+          <w:p>
+            <w:pPr>
+              <w:pStyle w:val="Celda"/>
+            </w:pPr>
+            <w:r>
+              <w:t xml:space="preserve">—</w:t>
+            </w:r>
+          </w:p>
+        </w:tc>
+        <w:tc>
+          <w:tcPr>
+            <w:tcW w:w="1558" w:type="dxa"/>
+          </w:tcPr>
+          <w:p>
+            <w:pPr>
+              <w:pStyle w:val="Celda"/>
+            </w:pPr>
+            <w:r>
+              <w:t xml:space="preserve">—</w:t>
+            </w:r>
+          </w:p>
+        </w:tc>
+        <w:tc>
+          <w:tcPr>
+            <w:tcW w:w="3837" w:type="dxa"/>
+          </w:tcPr>
+          <w:p>
+            <w:pPr>
+              <w:pStyle w:val="Celda"/>
+            </w:pPr>
+            <w:r>
+              <w:t xml:space="preserve">—</w:t>
+            </w:r>
+          </w:p>
+        </w:tc>
+      </w:tr>
+      <w:tr>
+        <w:trPr>
+          <w:cantSplit/>
+        </w:trPr>
+        <w:tc>
+          <w:tcPr>
+            <w:tcW w:w="539" w:type="dxa"/>
           </w:tcPr>
           <w:p>
             <w:pPr>
@@ -1070,7 +1269,7 @@
         </w:tc>
         <w:tc>
           <w:tcPr>
-            <w:tcW w:w="2480" w:type="dxa"/>
+            <w:tcW w:w="2278" w:type="dxa"/>
           </w:tcPr>
           <w:p>
             <w:pPr>
@@ -1083,7 +1282,7 @@
         </w:tc>
         <w:tc>
           <w:tcPr>
-            <w:tcW w:w="1612" w:type="dxa"/>
+            <w:tcW w:w="1439" w:type="dxa"/>
           </w:tcPr>
           <w:p>
             <w:pPr>
@@ -1096,7 +1295,7 @@
         </w:tc>
         <w:tc>
           <w:tcPr>
-            <w:tcW w:w="1736" w:type="dxa"/>
+            <w:tcW w:w="1558" w:type="dxa"/>
           </w:tcPr>
           <w:p>
             <w:pPr>
@@ -1109,20 +1308,20 @@
         </w:tc>
         <w:tc>
           <w:tcPr>
-            <w:tcW w:w="1860" w:type="dxa"/>
-          </w:tcPr>
-          <w:p>
-            <w:pPr>
-              <w:pStyle w:val="Celda"/>
-            </w:pPr>
-            <w:r>
-              <w:t xml:space="preserve">—</w:t>
-            </w:r>
-          </w:p>
-        </w:tc>
-        <w:tc>
-          <w:tcPr>
-            <w:tcW w:w="1860" w:type="dxa"/>
+            <w:tcW w:w="1678" w:type="dxa"/>
+          </w:tcPr>
+          <w:p>
+            <w:pPr>
+              <w:pStyle w:val="Celda"/>
+            </w:pPr>
+            <w:r>
+              <w:t xml:space="preserve">—</w:t>
+            </w:r>
+          </w:p>
+        </w:tc>
+        <w:tc>
+          <w:tcPr>
+            <w:tcW w:w="1678" w:type="dxa"/>
           </w:tcPr>
           <w:p>
             <w:pPr>
@@ -1135,25 +1334,38 @@
         </w:tc>
         <w:tc>
           <w:tcPr>
-            <w:tcW w:w="4464" w:type="dxa"/>
-          </w:tcPr>
-          <w:p>
-            <w:pPr>
-              <w:pStyle w:val="Celda"/>
-            </w:pPr>
-            <w:r>
-              <w:t xml:space="preserve">—</w:t>
-            </w:r>
-          </w:p>
-        </w:tc>
-      </w:tr>
-      <w:tr>
-        <w:trPr>
-          <w:cantSplit/>
-        </w:trPr>
-        <w:tc>
-          <w:tcPr>
-            <w:tcW w:w="558" w:type="dxa"/>
+            <w:tcW w:w="1558" w:type="dxa"/>
+          </w:tcPr>
+          <w:p>
+            <w:pPr>
+              <w:pStyle w:val="Celda"/>
+            </w:pPr>
+            <w:r>
+              <w:t xml:space="preserve">—</w:t>
+            </w:r>
+          </w:p>
+        </w:tc>
+        <w:tc>
+          <w:tcPr>
+            <w:tcW w:w="3837" w:type="dxa"/>
+          </w:tcPr>
+          <w:p>
+            <w:pPr>
+              <w:pStyle w:val="Celda"/>
+            </w:pPr>
+            <w:r>
+              <w:t xml:space="preserve">—</w:t>
+            </w:r>
+          </w:p>
+        </w:tc>
+      </w:tr>
+      <w:tr>
+        <w:trPr>
+          <w:cantSplit/>
+        </w:trPr>
+        <w:tc>
+          <w:tcPr>
+            <w:tcW w:w="539" w:type="dxa"/>
           </w:tcPr>
           <w:p>
             <w:pPr>
@@ -1166,7 +1378,7 @@
         </w:tc>
         <w:tc>
           <w:tcPr>
-            <w:tcW w:w="2480" w:type="dxa"/>
+            <w:tcW w:w="2278" w:type="dxa"/>
           </w:tcPr>
           <w:p>
             <w:pPr>
@@ -1179,7 +1391,7 @@
         </w:tc>
         <w:tc>
           <w:tcPr>
-            <w:tcW w:w="1612" w:type="dxa"/>
+            <w:tcW w:w="1439" w:type="dxa"/>
           </w:tcPr>
           <w:p>
             <w:pPr>
@@ -1192,7 +1404,7 @@
         </w:tc>
         <w:tc>
           <w:tcPr>
-            <w:tcW w:w="1736" w:type="dxa"/>
+            <w:tcW w:w="1558" w:type="dxa"/>
           </w:tcPr>
           <w:p>
             <w:pPr>
@@ -1205,51 +1417,64 @@
         </w:tc>
         <w:tc>
           <w:tcPr>
-            <w:tcW w:w="1860" w:type="dxa"/>
-          </w:tcPr>
-          <w:p>
-            <w:pPr>
-              <w:pStyle w:val="Celda"/>
-            </w:pPr>
-            <w:r>
-              <w:t xml:space="preserve">—</w:t>
-            </w:r>
-          </w:p>
-        </w:tc>
-        <w:tc>
-          <w:tcPr>
-            <w:tcW w:w="1860" w:type="dxa"/>
-          </w:tcPr>
-          <w:p>
-            <w:pPr>
-              <w:pStyle w:val="Celda"/>
-            </w:pPr>
-            <w:r>
-              <w:t xml:space="preserve">—</w:t>
-            </w:r>
-          </w:p>
-        </w:tc>
-        <w:tc>
-          <w:tcPr>
-            <w:tcW w:w="4464" w:type="dxa"/>
-          </w:tcPr>
-          <w:p>
-            <w:pPr>
-              <w:pStyle w:val="Celda"/>
-            </w:pPr>
-            <w:r>
-              <w:t xml:space="preserve">—</w:t>
-            </w:r>
-          </w:p>
-        </w:tc>
-      </w:tr>
-      <w:tr>
-        <w:trPr>
-          <w:cantSplit/>
-        </w:trPr>
-        <w:tc>
-          <w:tcPr>
-            <w:tcW w:w="558" w:type="dxa"/>
+            <w:tcW w:w="1678" w:type="dxa"/>
+          </w:tcPr>
+          <w:p>
+            <w:pPr>
+              <w:pStyle w:val="Celda"/>
+            </w:pPr>
+            <w:r>
+              <w:t xml:space="preserve">—</w:t>
+            </w:r>
+          </w:p>
+        </w:tc>
+        <w:tc>
+          <w:tcPr>
+            <w:tcW w:w="1678" w:type="dxa"/>
+          </w:tcPr>
+          <w:p>
+            <w:pPr>
+              <w:pStyle w:val="Celda"/>
+            </w:pPr>
+            <w:r>
+              <w:t xml:space="preserve">—</w:t>
+            </w:r>
+          </w:p>
+        </w:tc>
+        <w:tc>
+          <w:tcPr>
+            <w:tcW w:w="1558" w:type="dxa"/>
+          </w:tcPr>
+          <w:p>
+            <w:pPr>
+              <w:pStyle w:val="Celda"/>
+            </w:pPr>
+            <w:r>
+              <w:t xml:space="preserve">—</w:t>
+            </w:r>
+          </w:p>
+        </w:tc>
+        <w:tc>
+          <w:tcPr>
+            <w:tcW w:w="3837" w:type="dxa"/>
+          </w:tcPr>
+          <w:p>
+            <w:pPr>
+              <w:pStyle w:val="Celda"/>
+            </w:pPr>
+            <w:r>
+              <w:t xml:space="preserve">—</w:t>
+            </w:r>
+          </w:p>
+        </w:tc>
+      </w:tr>
+      <w:tr>
+        <w:trPr>
+          <w:cantSplit/>
+        </w:trPr>
+        <w:tc>
+          <w:tcPr>
+            <w:tcW w:w="539" w:type="dxa"/>
           </w:tcPr>
           <w:p>
             <w:pPr>
@@ -1262,7 +1487,7 @@
         </w:tc>
         <w:tc>
           <w:tcPr>
-            <w:tcW w:w="2480" w:type="dxa"/>
+            <w:tcW w:w="2278" w:type="dxa"/>
           </w:tcPr>
           <w:p>
             <w:pPr>
@@ -1275,7 +1500,7 @@
         </w:tc>
         <w:tc>
           <w:tcPr>
-            <w:tcW w:w="1612" w:type="dxa"/>
+            <w:tcW w:w="1439" w:type="dxa"/>
           </w:tcPr>
           <w:p>
             <w:pPr>
@@ -1288,7 +1513,7 @@
         </w:tc>
         <w:tc>
           <w:tcPr>
-            <w:tcW w:w="1736" w:type="dxa"/>
+            <w:tcW w:w="1558" w:type="dxa"/>
           </w:tcPr>
           <w:p>
             <w:pPr>
@@ -1301,51 +1526,64 @@
         </w:tc>
         <w:tc>
           <w:tcPr>
-            <w:tcW w:w="1860" w:type="dxa"/>
-          </w:tcPr>
-          <w:p>
-            <w:pPr>
-              <w:pStyle w:val="Celda"/>
-            </w:pPr>
-            <w:r>
-              <w:t xml:space="preserve">—</w:t>
-            </w:r>
-          </w:p>
-        </w:tc>
-        <w:tc>
-          <w:tcPr>
-            <w:tcW w:w="1860" w:type="dxa"/>
-          </w:tcPr>
-          <w:p>
-            <w:pPr>
-              <w:pStyle w:val="Celda"/>
-            </w:pPr>
-            <w:r>
-              <w:t xml:space="preserve">—</w:t>
-            </w:r>
-          </w:p>
-        </w:tc>
-        <w:tc>
-          <w:tcPr>
-            <w:tcW w:w="4464" w:type="dxa"/>
-          </w:tcPr>
-          <w:p>
-            <w:pPr>
-              <w:pStyle w:val="Celda"/>
-            </w:pPr>
-            <w:r>
-              <w:t xml:space="preserve">—</w:t>
-            </w:r>
-          </w:p>
-        </w:tc>
-      </w:tr>
-      <w:tr>
-        <w:trPr>
-          <w:cantSplit/>
-        </w:trPr>
-        <w:tc>
-          <w:tcPr>
-            <w:tcW w:w="558" w:type="dxa"/>
+            <w:tcW w:w="1678" w:type="dxa"/>
+          </w:tcPr>
+          <w:p>
+            <w:pPr>
+              <w:pStyle w:val="Celda"/>
+            </w:pPr>
+            <w:r>
+              <w:t xml:space="preserve">—</w:t>
+            </w:r>
+          </w:p>
+        </w:tc>
+        <w:tc>
+          <w:tcPr>
+            <w:tcW w:w="1678" w:type="dxa"/>
+          </w:tcPr>
+          <w:p>
+            <w:pPr>
+              <w:pStyle w:val="Celda"/>
+            </w:pPr>
+            <w:r>
+              <w:t xml:space="preserve">—</w:t>
+            </w:r>
+          </w:p>
+        </w:tc>
+        <w:tc>
+          <w:tcPr>
+            <w:tcW w:w="1558" w:type="dxa"/>
+          </w:tcPr>
+          <w:p>
+            <w:pPr>
+              <w:pStyle w:val="Celda"/>
+            </w:pPr>
+            <w:r>
+              <w:t xml:space="preserve">—</w:t>
+            </w:r>
+          </w:p>
+        </w:tc>
+        <w:tc>
+          <w:tcPr>
+            <w:tcW w:w="3837" w:type="dxa"/>
+          </w:tcPr>
+          <w:p>
+            <w:pPr>
+              <w:pStyle w:val="Celda"/>
+            </w:pPr>
+            <w:r>
+              <w:t xml:space="preserve">—</w:t>
+            </w:r>
+          </w:p>
+        </w:tc>
+      </w:tr>
+      <w:tr>
+        <w:trPr>
+          <w:cantSplit/>
+        </w:trPr>
+        <w:tc>
+          <w:tcPr>
+            <w:tcW w:w="539" w:type="dxa"/>
           </w:tcPr>
           <w:p>
             <w:pPr>
@@ -1358,7 +1596,7 @@
         </w:tc>
         <w:tc>
           <w:tcPr>
-            <w:tcW w:w="2480" w:type="dxa"/>
+            <w:tcW w:w="2278" w:type="dxa"/>
           </w:tcPr>
           <w:p>
             <w:pPr>
@@ -1371,7 +1609,7 @@
         </w:tc>
         <w:tc>
           <w:tcPr>
-            <w:tcW w:w="1612" w:type="dxa"/>
+            <w:tcW w:w="1439" w:type="dxa"/>
           </w:tcPr>
           <w:p>
             <w:pPr>
@@ -1384,7 +1622,7 @@
         </w:tc>
         <w:tc>
           <w:tcPr>
-            <w:tcW w:w="1736" w:type="dxa"/>
+            <w:tcW w:w="1558" w:type="dxa"/>
           </w:tcPr>
           <w:p>
             <w:pPr>
@@ -1397,51 +1635,64 @@
         </w:tc>
         <w:tc>
           <w:tcPr>
-            <w:tcW w:w="1860" w:type="dxa"/>
-          </w:tcPr>
-          <w:p>
-            <w:pPr>
-              <w:pStyle w:val="Celda"/>
-            </w:pPr>
-            <w:r>
-              <w:t xml:space="preserve">—</w:t>
-            </w:r>
-          </w:p>
-        </w:tc>
-        <w:tc>
-          <w:tcPr>
-            <w:tcW w:w="1860" w:type="dxa"/>
-          </w:tcPr>
-          <w:p>
-            <w:pPr>
-              <w:pStyle w:val="Celda"/>
-            </w:pPr>
-            <w:r>
-              <w:t xml:space="preserve">—</w:t>
-            </w:r>
-          </w:p>
-        </w:tc>
-        <w:tc>
-          <w:tcPr>
-            <w:tcW w:w="4464" w:type="dxa"/>
-          </w:tcPr>
-          <w:p>
-            <w:pPr>
-              <w:pStyle w:val="Celda"/>
-            </w:pPr>
-            <w:r>
-              <w:t xml:space="preserve">—</w:t>
-            </w:r>
-          </w:p>
-        </w:tc>
-      </w:tr>
-      <w:tr>
-        <w:trPr>
-          <w:cantSplit/>
-        </w:trPr>
-        <w:tc>
-          <w:tcPr>
-            <w:tcW w:w="558" w:type="dxa"/>
+            <w:tcW w:w="1678" w:type="dxa"/>
+          </w:tcPr>
+          <w:p>
+            <w:pPr>
+              <w:pStyle w:val="Celda"/>
+            </w:pPr>
+            <w:r>
+              <w:t xml:space="preserve">—</w:t>
+            </w:r>
+          </w:p>
+        </w:tc>
+        <w:tc>
+          <w:tcPr>
+            <w:tcW w:w="1678" w:type="dxa"/>
+          </w:tcPr>
+          <w:p>
+            <w:pPr>
+              <w:pStyle w:val="Celda"/>
+            </w:pPr>
+            <w:r>
+              <w:t xml:space="preserve">—</w:t>
+            </w:r>
+          </w:p>
+        </w:tc>
+        <w:tc>
+          <w:tcPr>
+            <w:tcW w:w="1558" w:type="dxa"/>
+          </w:tcPr>
+          <w:p>
+            <w:pPr>
+              <w:pStyle w:val="Celda"/>
+            </w:pPr>
+            <w:r>
+              <w:t xml:space="preserve">—</w:t>
+            </w:r>
+          </w:p>
+        </w:tc>
+        <w:tc>
+          <w:tcPr>
+            <w:tcW w:w="3837" w:type="dxa"/>
+          </w:tcPr>
+          <w:p>
+            <w:pPr>
+              <w:pStyle w:val="Celda"/>
+            </w:pPr>
+            <w:r>
+              <w:t xml:space="preserve">—</w:t>
+            </w:r>
+          </w:p>
+        </w:tc>
+      </w:tr>
+      <w:tr>
+        <w:trPr>
+          <w:cantSplit/>
+        </w:trPr>
+        <w:tc>
+          <w:tcPr>
+            <w:tcW w:w="539" w:type="dxa"/>
           </w:tcPr>
           <w:p>
             <w:pPr>
@@ -1454,7 +1705,7 @@
         </w:tc>
         <w:tc>
           <w:tcPr>
-            <w:tcW w:w="2480" w:type="dxa"/>
+            <w:tcW w:w="2278" w:type="dxa"/>
           </w:tcPr>
           <w:p>
             <w:pPr>
@@ -1467,7 +1718,7 @@
         </w:tc>
         <w:tc>
           <w:tcPr>
-            <w:tcW w:w="1612" w:type="dxa"/>
+            <w:tcW w:w="1439" w:type="dxa"/>
           </w:tcPr>
           <w:p>
             <w:pPr>
@@ -1480,7 +1731,7 @@
         </w:tc>
         <w:tc>
           <w:tcPr>
-            <w:tcW w:w="1736" w:type="dxa"/>
+            <w:tcW w:w="1558" w:type="dxa"/>
           </w:tcPr>
           <w:p>
             <w:pPr>
@@ -1493,33 +1744,46 @@
         </w:tc>
         <w:tc>
           <w:tcPr>
-            <w:tcW w:w="1860" w:type="dxa"/>
-          </w:tcPr>
-          <w:p>
-            <w:pPr>
-              <w:pStyle w:val="Celda"/>
-            </w:pPr>
-            <w:r>
-              <w:t xml:space="preserve">—</w:t>
-            </w:r>
-          </w:p>
-        </w:tc>
-        <w:tc>
-          <w:tcPr>
-            <w:tcW w:w="1860" w:type="dxa"/>
-          </w:tcPr>
-          <w:p>
-            <w:pPr>
-              <w:pStyle w:val="Celda"/>
-            </w:pPr>
-            <w:r>
-              <w:t xml:space="preserve">—</w:t>
-            </w:r>
-          </w:p>
-        </w:tc>
-        <w:tc>
-          <w:tcPr>
-            <w:tcW w:w="4464" w:type="dxa"/>
+            <w:tcW w:w="1678" w:type="dxa"/>
+          </w:tcPr>
+          <w:p>
+            <w:pPr>
+              <w:pStyle w:val="Celda"/>
+            </w:pPr>
+            <w:r>
+              <w:t xml:space="preserve">—</w:t>
+            </w:r>
+          </w:p>
+        </w:tc>
+        <w:tc>
+          <w:tcPr>
+            <w:tcW w:w="1678" w:type="dxa"/>
+          </w:tcPr>
+          <w:p>
+            <w:pPr>
+              <w:pStyle w:val="Celda"/>
+            </w:pPr>
+            <w:r>
+              <w:t xml:space="preserve">—</w:t>
+            </w:r>
+          </w:p>
+        </w:tc>
+        <w:tc>
+          <w:tcPr>
+            <w:tcW w:w="1558" w:type="dxa"/>
+          </w:tcPr>
+          <w:p>
+            <w:pPr>
+              <w:pStyle w:val="Celda"/>
+            </w:pPr>
+            <w:r>
+              <w:t xml:space="preserve">—</w:t>
+            </w:r>
+          </w:p>
+        </w:tc>
+        <w:tc>
+          <w:tcPr>
+            <w:tcW w:w="3837" w:type="dxa"/>
           </w:tcPr>
           <w:p>
             <w:pPr>
@@ -1549,6 +1813,9 @@
         <w:t xml:space="preserve">• </w:t>
       </w:r>
       <w:r>
+        <w:t xml:space="preserve">Inicio: </w:t>
+      </w:r>
+      <w:r>
         <w:rPr>
           <w:b/>
         </w:rPr>
@@ -1635,7 +1902,7 @@
         <w:t xml:space="preserve">– </w:t>
       </w:r>
       <w:r>
-        <w:t xml:space="preserve">Sí: ir a </w:t>
+        <w:t xml:space="preserve">Sí (por defecto): ir a </w:t>
       </w:r>
       <w:r>
         <w:rPr>
@@ -1724,7 +1991,7 @@
         <w:t xml:space="preserve">10 días sin respuesta</w:t>
       </w:r>
       <w:r>
-        <w:t xml:space="preserve"> (P10D), sin interrumpir la actividad → </w:t>
+        <w:t xml:space="preserve">, sin interrumpir la actividad → </w:t>
       </w:r>
       <w:r>
         <w:rPr>
@@ -1750,7 +2017,7 @@
         <w:t xml:space="preserve">Plazo vencido (30 días)</w:t>
       </w:r>
       <w:r>
-        <w:t xml:space="preserve"> (P30D), interrumpe la actividad → </w:t>
+        <w:t xml:space="preserve">, interrumpe la actividad → </w:t>
       </w:r>
       <w:r>
         <w:rPr>
@@ -1767,19 +2034,13 @@
         <w:t xml:space="preserve">• </w:t>
       </w:r>
       <w:r>
+        <w:t xml:space="preserve">Fin: </w:t>
+      </w:r>
+      <w:r>
         <w:rPr>
           <w:b/>
         </w:rPr>
-        <w:t xml:space="preserve">Redactar respuesta</w:t>
-      </w:r>
-      <w:r>
-        <w:t xml:space="preserve"> → </w:t>
-      </w:r>
-      <w:r>
-        <w:rPr>
-          <w:i/>
-        </w:rPr>
-        <w:t xml:space="preserve">Notificar respuesta</w:t>
+        <w:t xml:space="preserve">Reclamo improcedente</w:t>
       </w:r>
     </w:p>
     <w:p>
@@ -1793,7 +2054,7 @@
         <w:rPr>
           <w:b/>
         </w:rPr>
-        <w:t xml:space="preserve">Alertar a jefatura</w:t>
+        <w:t xml:space="preserve">Redactar respuesta</w:t>
       </w:r>
       <w:r>
         <w:t xml:space="preserve"> → </w:t>
@@ -1802,7 +2063,7 @@
         <w:rPr>
           <w:i/>
         </w:rPr>
-        <w:t xml:space="preserve">Alerta enviada</w:t>
+        <w:t xml:space="preserve">Notificar respuesta</w:t>
       </w:r>
     </w:p>
     <w:p>
@@ -1816,7 +2077,7 @@
         <w:rPr>
           <w:b/>
         </w:rPr>
-        <w:t xml:space="preserve">Resolver por jefatura</w:t>
+        <w:t xml:space="preserve">Alertar a jefatura</w:t>
       </w:r>
       <w:r>
         <w:t xml:space="preserve"> → </w:t>
@@ -1825,7 +2086,7 @@
         <w:rPr>
           <w:i/>
         </w:rPr>
-        <w:t xml:space="preserve">Notificar respuesta</w:t>
+        <w:t xml:space="preserve">Alerta enviada</w:t>
       </w:r>
     </w:p>
     <w:p>
@@ -1836,13 +2097,19 @@
         <w:t xml:space="preserve">• </w:t>
       </w:r>
       <w:r>
-        <w:t xml:space="preserve">Fin: </w:t>
-      </w:r>
-      <w:r>
         <w:rPr>
           <w:b/>
         </w:rPr>
-        <w:t xml:space="preserve">Reclamo improcedente</w:t>
+        <w:t xml:space="preserve">Resolver por jefatura</w:t>
+      </w:r>
+      <w:r>
+        <w:t xml:space="preserve"> → </w:t>
+      </w:r>
+      <w:r>
+        <w:rPr>
+          <w:i/>
+        </w:rPr>
+        <w:t xml:space="preserve">Notificar respuesta</w:t>
       </w:r>
     </w:p>
     <w:p>
@@ -2088,7 +2355,7 @@
               <w:pStyle w:val="Celda"/>
             </w:pPr>
             <w:r>
-              <w:t xml:space="preserve">Sí</w:t>
+              <w:t xml:space="preserve">Sí (por defecto)</w:t>
             </w:r>
           </w:p>
         </w:tc>
@@ -2353,7 +2620,7 @@
               <w:pStyle w:val="Celda"/>
             </w:pPr>
             <w:r>
-              <w:t xml:space="preserve">P10D</w:t>
+              <w:t xml:space="preserve">10 días</w:t>
             </w:r>
           </w:p>
         </w:tc>
@@ -2436,7 +2703,7 @@
               <w:pStyle w:val="Celda"/>
             </w:pPr>
             <w:r>
-              <w:t xml:space="preserve">P30D</w:t>
+              <w:t xml:space="preserve">30 días</w:t>
             </w:r>
           </w:p>
         </w:tc>
@@ -2627,7 +2894,7 @@
                 <w:b/>
                 <w:color w:val="FFFFFF"/>
               </w:rPr>
-              <w:t xml:space="preserve">Se usa en</w:t>
+              <w:t xml:space="preserve">Lo usan (entrada)</w:t>
             </w:r>
           </w:p>
         </w:tc>
@@ -2645,7 +2912,7 @@
                 <w:b/>
                 <w:color w:val="FFFFFF"/>
               </w:rPr>
-              <w:t xml:space="preserve">Lo produce</w:t>
+              <w:t xml:space="preserve">Lo generan o actualizan</w:t>
             </w:r>
           </w:p>
         </w:tc>
@@ -2733,7 +3000,7 @@
               <w:pStyle w:val="Celda"/>
             </w:pPr>
             <w:r>
-              <w:t xml:space="preserve">Almacén / sistema</w:t>
+              <w:t xml:space="preserve">Sistema / registro</w:t>
             </w:r>
           </w:p>
         </w:tc>

</xml_diff>

<commit_message>
v0.5.0: plantilla Word propia y genérica (--template)
- Cualquier .docx/.dotx como plantilla: conserva carátula, logos,
  encabezados/pies, márgenes y estilos
- Marcadores {{CONTENIDO}}, {{nombre}}, {{codigo}}, {{version}}, {{fecha}},
  firmas y cualquier clave de meta (también en encabezados y pies)
- Estilos de la plantilla por nombre interno (funciona en Word en español)
- Secciones copiadas de la plantilla; solo cambia la orientación del diagrama
- plantillas/plantilla-ejemplo.docx neutra; CI prueba el modo plantilla

Co-Authored-By: Claude Opus 5.5 <noreply@anthropic.com>
</commit_message>
<xml_diff>
--- a/docs/atencion-reclamos.docx
+++ b/docs/atencion-reclamos.docx
@@ -582,15 +582,15 @@
       </w:pPr>
       <w:r>
         <w:drawing>
-          <wp:inline distT="0" distB="0" distL="0" distR="0">
+          <wp:inline xmlns:wp="http://schemas.openxmlformats.org/drawingml/2006/wordprocessingDrawing" distT="0" distB="0" distL="0" distR="0">
             <wp:extent cx="8890626" cy="5231130"/>
             <wp:docPr id="1" name="Diagrama 1" descr="Diagrama BPMN del proceso Atención de reclamos"/>
             <wp:cNvGraphicFramePr>
-              <a:graphicFrameLocks noChangeAspect="1"/>
+              <a:graphicFrameLocks xmlns:a="http://schemas.openxmlformats.org/drawingml/2006/main" noChangeAspect="1"/>
             </wp:cNvGraphicFramePr>
-            <a:graphic>
+            <a:graphic xmlns:a="http://schemas.openxmlformats.org/drawingml/2006/main">
               <a:graphicData uri="http://schemas.openxmlformats.org/drawingml/2006/picture">
-                <pic:pic>
+                <pic:pic xmlns:pic="http://schemas.openxmlformats.org/drawingml/2006/picture">
                   <pic:nvPicPr>
                     <pic:cNvPr id="1" name="diagrama1.png"/>
                     <pic:cNvPicPr/>

</xml_diff>